<commit_message>
Merging from home pc
</commit_message>
<xml_diff>
--- a/Workshops/Workshop 7 - LM with multiple predictors/Workshop-7---LM-with-multiple-predictors--with-answers-.docx
+++ b/Workshops/Workshop 7 - LM with multiple predictors/Workshop-7---LM-with-multiple-predictors--with-answers-.docx
@@ -95,7 +95,7 @@
         <w:t xml:space="preserve"> </w:t>
       </w:r>
       <w:r>
-        <w:t xml:space="preserve">2024-10-03</w:t>
+        <w:t xml:space="preserve">2024-10-13</w:t>
       </w:r>
     </w:p>
     <w:sdt>
@@ -2556,7 +2556,7 @@
         <w:rPr>
           <w:rStyle w:val="CommentTok"/>
         </w:rPr>
-        <w:t xml:space="preserve"># Our confidence intervals will be artificially inflated, making our predictions look more uncertain than they should be.</w:t>
+        <w:t xml:space="preserve"># Our confidence intervals will either be artificially inflated or deflated (i.e. either too small or too big), making our predictions look more or less uncertain than they should be.</w:t>
       </w:r>
     </w:p>
     <w:p>
@@ -5049,13 +5049,13 @@
         <w:t xml:space="preserve">()</w:t>
       </w:r>
     </w:p>
-    <w:bookmarkStart w:id="57" w:name="question-set-five"/>
+    <w:bookmarkStart w:id="57" w:name="question-set-two"/>
     <w:p>
       <w:pPr>
         <w:pStyle w:val="Heading3"/>
       </w:pPr>
       <w:r>
-        <w:t xml:space="preserve">Question Set Five</w:t>
+        <w:t xml:space="preserve">Question Set Two</w:t>
       </w:r>
     </w:p>
     <w:p>
@@ -8895,7 +8895,7 @@
         <w:rPr>
           <w:rStyle w:val="CommentTok"/>
         </w:rPr>
-        <w:t xml:space="preserve"># This is the same DAG as above. Nothing actually changes in the DAG even though our reseasrch question has.</w:t>
+        <w:t xml:space="preserve"># This is the same DAG as above. Nothing actually changes in the DAG even though our research question has.</w:t>
       </w:r>
       <w:r>
         <w:br/>

</xml_diff>